<commit_message>
docs: DOCX compacto - elimina keepNext, horizontal rules y restaura portada
- Quita keepNext/keepLines de todos los estilos de encabezado (causa principal
  de páginas en blanco por headings huérfanos).
- preprocess.py: elimina los 83 separadores '---' decorativos (se mantienen
  solo los separadores de tabla markdown) y colapsa líneas en blanco.
- Restaura la portada APA con salto de página OpenXML al inicio.
- Documento final más compacto: sin páginas en blanco por orphan headings,
  menos espacio vertical desperdiciado.

Co-Authored-By: Claude Opus 4.7 (1M context) <noreply@anthropic.com>
</commit_message>
<xml_diff>
--- a/docs/DERCAS.docx
+++ b/docs/DERCAS.docx
@@ -44,6 +44,73 @@
         </w:p>
       </w:sdtContent>
     </w:sdt>
+    <w:p>
+      <w:pPr>
+        <w:pStyle w:val="Portada"/>
+      </w:pPr>
+      <w:r>
+        <w:t xml:space="preserve">UNIVERSIDAD MARIANO GÁLVEZ DE GUATEMALA</w:t>
+      </w:r>
+    </w:p>
+    <w:p>
+      <w:pPr>
+        <w:pStyle w:val="Portada"/>
+      </w:pPr>
+      <w:r>
+        <w:t xml:space="preserve">FACULTAD DE INGENIERÍA EN SISTEMAS</w:t>
+      </w:r>
+    </w:p>
+    <w:p>
+      <w:pPr>
+        <w:pStyle w:val="Portada"/>
+      </w:pPr>
+      <w:r>
+        <w:t xml:space="preserve">ANÁLISIS DE SISTEMAS I</w:t>
+      </w:r>
+    </w:p>
+    <w:p>
+      <w:pPr>
+        <w:pStyle w:val="Portada"/>
+      </w:pPr>
+      <w:r>
+        <w:t xml:space="preserve">PROYECTO II — DERCAS</w:t>
+      </w:r>
+    </w:p>
+    <w:p>
+      <w:pPr>
+        <w:pStyle w:val="Portada"/>
+      </w:pPr>
+      <w:r>
+        <w:t xml:space="preserve">Sistema de Gestión y Comercialización Agrícola</w:t>
+      </w:r>
+      <w:r>
+        <w:t xml:space="preserve"> </w:t>
+      </w:r>
+      <w:r>
+        <w:t xml:space="preserve">“La Esperanza”</w:t>
+      </w:r>
+    </w:p>
+    <w:p>
+      <w:pPr>
+        <w:pStyle w:val="Portada"/>
+      </w:pPr>
+      <w:r>
+        <w:t xml:space="preserve">Alex Alvarado</w:t>
+      </w:r>
+    </w:p>
+    <w:p>
+      <w:pPr>
+        <w:pStyle w:val="Portada"/>
+      </w:pPr>
+      <w:r>
+        <w:t xml:space="preserve">Guatemala, 17 de abril de 2026</w:t>
+      </w:r>
+    </w:p>
+    <w:p>
+      <w:r>
+        <w:br w:type="page"/>
+      </w:r>
+    </w:p>
     <w:bookmarkStart w:id="259" w:name="Xc1db268e0b13ba93d428ec0f18a12ff87c16653"/>
     <w:p>
       <w:pPr>
@@ -95,13 +162,6 @@
       </w:r>
       <w:r>
         <w:t xml:space="preserve">.</w:t>
-      </w:r>
-    </w:p>
-    <w:p>
-      <w:r>
-        <w:pict>
-          <v:rect style="width:0;height:1.5pt" o:hralign="center" o:hrstd="t" o:hr="t"/>
-        </w:pict>
       </w:r>
     </w:p>
     <w:bookmarkStart w:id="19" w:name="descripción-general-del-sistema"/>
@@ -600,13 +660,6 @@
         <w:t xml:space="preserve">No ofrece logística ni transporte: el productor y el comprador acuerdan quién traslada el producto, y el sistema solo registra el punto de entrega seleccionado del catálogo mantenido por la Asociación.</w:t>
       </w:r>
     </w:p>
-    <w:p>
-      <w:r>
-        <w:pict>
-          <v:rect style="width:0;height:1.5pt" o:hralign="center" o:hrstd="t" o:hr="t"/>
-        </w:pict>
-      </w:r>
-    </w:p>
     <w:bookmarkEnd w:id="9"/>
     <w:bookmarkStart w:id="14" w:name="usuarios-del-sistema"/>
     <w:p>
@@ -1647,13 +1700,6 @@
       </w:pPr>
       <w:r>
         <w:t xml:space="preserve">Gestionar su propio perfil (UC32, UC33).</w:t>
-      </w:r>
-    </w:p>
-    <w:p>
-      <w:r>
-        <w:pict>
-          <v:rect style="width:0;height:1.5pt" o:hralign="center" o:hrstd="t" o:hr="t"/>
-        </w:pict>
       </w:r>
     </w:p>
     <w:bookmarkEnd w:id="13"/>
@@ -2686,20 +2732,6 @@
         </w:tc>
       </w:tr>
     </w:tbl>
-    <w:p>
-      <w:r>
-        <w:pict>
-          <v:rect style="width:0;height:1.5pt" o:hralign="center" o:hrstd="t" o:hr="t"/>
-        </w:pict>
-      </w:r>
-    </w:p>
-    <w:p>
-      <w:r>
-        <w:pict>
-          <v:rect style="width:0;height:1.5pt" o:hralign="center" o:hrstd="t" o:hr="t"/>
-        </w:pict>
-      </w:r>
-    </w:p>
     <w:bookmarkEnd w:id="17"/>
     <w:bookmarkEnd w:id="18"/>
     <w:bookmarkEnd w:id="19"/>
@@ -4152,13 +4184,6 @@
         </w:tc>
       </w:tr>
     </w:tbl>
-    <w:p>
-      <w:r>
-        <w:pict>
-          <v:rect style="width:0;height:1.5pt" o:hralign="center" o:hrstd="t" o:hr="t"/>
-        </w:pict>
-      </w:r>
-    </w:p>
     <w:bookmarkEnd w:id="25"/>
     <w:bookmarkEnd w:id="26"/>
     <w:bookmarkStart w:id="31" w:name="gestión-de-productos-productor"/>
@@ -5140,13 +5165,6 @@
         </w:tc>
       </w:tr>
     </w:tbl>
-    <w:p>
-      <w:r>
-        <w:pict>
-          <v:rect style="width:0;height:1.5pt" o:hralign="center" o:hrstd="t" o:hr="t"/>
-        </w:pict>
-      </w:r>
-    </w:p>
     <w:bookmarkEnd w:id="30"/>
     <w:bookmarkEnd w:id="31"/>
     <w:bookmarkStart w:id="35" w:name="catálogo-público-y-solicitud-de-compra"/>
@@ -5897,13 +5915,6 @@
         </w:tc>
       </w:tr>
     </w:tbl>
-    <w:p>
-      <w:r>
-        <w:pict>
-          <v:rect style="width:0;height:1.5pt" o:hralign="center" o:hrstd="t" o:hr="t"/>
-        </w:pict>
-      </w:r>
-    </w:p>
     <w:bookmarkEnd w:id="34"/>
     <w:bookmarkEnd w:id="35"/>
     <w:bookmarkStart w:id="45" w:name="gestión-del-acuerdo-comercial"/>
@@ -8151,13 +8162,6 @@
         </w:tc>
       </w:tr>
     </w:tbl>
-    <w:p>
-      <w:r>
-        <w:pict>
-          <v:rect style="width:0;height:1.5pt" o:hralign="center" o:hrstd="t" o:hr="t"/>
-        </w:pict>
-      </w:r>
-    </w:p>
     <w:bookmarkEnd w:id="44"/>
     <w:bookmarkEnd w:id="45"/>
     <w:bookmarkStart w:id="49" w:name="catálogos-maestros-administrador"/>
@@ -8867,13 +8871,6 @@
         </w:tc>
       </w:tr>
     </w:tbl>
-    <w:p>
-      <w:r>
-        <w:pict>
-          <v:rect style="width:0;height:1.5pt" o:hralign="center" o:hrstd="t" o:hr="t"/>
-        </w:pict>
-      </w:r>
-    </w:p>
     <w:bookmarkEnd w:id="48"/>
     <w:bookmarkEnd w:id="49"/>
     <w:bookmarkStart w:id="55" w:name="gestión-de-usuarios-administrador"/>
@@ -10092,13 +10089,6 @@
         </w:tc>
       </w:tr>
     </w:tbl>
-    <w:p>
-      <w:r>
-        <w:pict>
-          <v:rect style="width:0;height:1.5pt" o:hralign="center" o:hrstd="t" o:hr="t"/>
-        </w:pict>
-      </w:r>
-    </w:p>
     <w:bookmarkEnd w:id="54"/>
     <w:bookmarkEnd w:id="55"/>
     <w:bookmarkStart w:id="59" w:name="incidencias-y-supervisión"/>
@@ -10892,13 +10882,6 @@
         </w:tc>
       </w:tr>
     </w:tbl>
-    <w:p>
-      <w:r>
-        <w:pict>
-          <v:rect style="width:0;height:1.5pt" o:hralign="center" o:hrstd="t" o:hr="t"/>
-        </w:pict>
-      </w:r>
-    </w:p>
     <w:bookmarkEnd w:id="58"/>
     <w:bookmarkEnd w:id="59"/>
     <w:bookmarkStart w:id="63" w:name="reportes-y-analítica"/>
@@ -11621,13 +11604,6 @@
         </w:tc>
       </w:tr>
     </w:tbl>
-    <w:p>
-      <w:r>
-        <w:pict>
-          <v:rect style="width:0;height:1.5pt" o:hralign="center" o:hrstd="t" o:hr="t"/>
-        </w:pict>
-      </w:r>
-    </w:p>
     <w:bookmarkEnd w:id="62"/>
     <w:bookmarkEnd w:id="63"/>
     <w:bookmarkStart w:id="68" w:name="X16b764061b585377bfb178e7f29208611862413"/>
@@ -12567,13 +12543,6 @@
         </w:tc>
       </w:tr>
     </w:tbl>
-    <w:p>
-      <w:r>
-        <w:pict>
-          <v:rect style="width:0;height:1.5pt" o:hralign="center" o:hrstd="t" o:hr="t"/>
-        </w:pict>
-      </w:r>
-    </w:p>
     <w:bookmarkEnd w:id="67"/>
     <w:bookmarkEnd w:id="68"/>
     <w:bookmarkStart w:id="69" w:name="matriz-resumen-de-prioridades"/>
@@ -12778,20 +12747,6 @@
         <w:t xml:space="preserve">La prioridad se usa como criterio para planificar la implementación en fases: los RF de prioridad Alta deben estar operativos en la primera iteración del sistema; los de prioridad Media en la segunda; los de prioridad Baja pueden diferirse.</w:t>
       </w:r>
     </w:p>
-    <w:p>
-      <w:r>
-        <w:pict>
-          <v:rect style="width:0;height:1.5pt" o:hralign="center" o:hrstd="t" o:hr="t"/>
-        </w:pict>
-      </w:r>
-    </w:p>
-    <w:p>
-      <w:r>
-        <w:pict>
-          <v:rect style="width:0;height:1.5pt" o:hralign="center" o:hrstd="t" o:hr="t"/>
-        </w:pict>
-      </w:r>
-    </w:p>
     <w:bookmarkEnd w:id="69"/>
     <w:bookmarkEnd w:id="70"/>
     <w:bookmarkStart w:id="119" w:name="requerimientos-no-funcionales"/>
@@ -13179,13 +13134,6 @@
         <w:t xml:space="preserve">de almacenamiento en el dispositivo del cliente para catálogo cacheado, cola de sincronización offline y datos de sesión. Al aproximarse a ese límite, se aplica política LRU sobre el catálogo antiguo.</w:t>
       </w:r>
     </w:p>
-    <w:p>
-      <w:r>
-        <w:pict>
-          <v:rect style="width:0;height:1.5pt" o:hralign="center" o:hrstd="t" o:hr="t"/>
-        </w:pict>
-      </w:r>
-    </w:p>
     <w:bookmarkEnd w:id="75"/>
     <w:bookmarkEnd w:id="76"/>
     <w:bookmarkStart w:id="86" w:name="seguridad"/>
@@ -13657,13 +13605,6 @@
         <w:t xml:space="preserve">para mitigar XSS, clickjacking y filtración de referer.</w:t>
       </w:r>
     </w:p>
-    <w:p>
-      <w:r>
-        <w:pict>
-          <v:rect style="width:0;height:1.5pt" o:hralign="center" o:hrstd="t" o:hr="t"/>
-        </w:pict>
-      </w:r>
-    </w:p>
     <w:bookmarkEnd w:id="85"/>
     <w:bookmarkEnd w:id="86"/>
     <w:bookmarkStart w:id="91" w:name="escalabilidad"/>
@@ -13836,13 +13777,6 @@
         <w:t xml:space="preserve">La infraestructura debe poder replicarse en un entorno nuevo mediante archivos de configuración versionados (Docker Compose, Terraform o equivalente) para habilitar staging, producción y eventualmente réplicas regionales.</w:t>
       </w:r>
     </w:p>
-    <w:p>
-      <w:r>
-        <w:pict>
-          <v:rect style="width:0;height:1.5pt" o:hralign="center" o:hrstd="t" o:hr="t"/>
-        </w:pict>
-      </w:r>
-    </w:p>
     <w:bookmarkEnd w:id="90"/>
     <w:bookmarkEnd w:id="91"/>
     <w:bookmarkStart w:id="99" w:name="usabilidad"/>
@@ -14211,13 +14145,6 @@
         <w:t xml:space="preserve">. Este requerimiento se valida con pruebas con usuarios reales antes del despliegue.</w:t>
       </w:r>
     </w:p>
-    <w:p>
-      <w:r>
-        <w:pict>
-          <v:rect style="width:0;height:1.5pt" o:hralign="center" o:hrstd="t" o:hr="t"/>
-        </w:pict>
-      </w:r>
-    </w:p>
     <w:bookmarkEnd w:id="98"/>
     <w:bookmarkEnd w:id="99"/>
     <w:bookmarkStart w:id="106" w:name="mantenibilidad"/>
@@ -14509,13 +14436,6 @@
         <w:t xml:space="preserve">con los costos recurrentes de mantenimiento (hosting, dominio, SMS, respaldo) y una estimación de costo del proveedor externo de soporte. Este documento acompaña al código fuente.</w:t>
       </w:r>
     </w:p>
-    <w:p>
-      <w:r>
-        <w:pict>
-          <v:rect style="width:0;height:1.5pt" o:hralign="center" o:hrstd="t" o:hr="t"/>
-        </w:pict>
-      </w:r>
-    </w:p>
     <w:bookmarkEnd w:id="105"/>
     <w:bookmarkEnd w:id="106"/>
     <w:bookmarkStart w:id="111" w:name="compatibilidad"/>
@@ -14675,13 +14595,6 @@
         <w:t xml:space="preserve">La solución evita dependencias cerradas del lado del cliente que impidan cambiar de proveedor de infraestructura. El almacenamiento, el gateway SMS y el hosting se pueden intercambiar sin reescribir el código de la lógica de negocio.</w:t>
       </w:r>
     </w:p>
-    <w:p>
-      <w:r>
-        <w:pict>
-          <v:rect style="width:0;height:1.5pt" o:hralign="center" o:hrstd="t" o:hr="t"/>
-        </w:pict>
-      </w:r>
-    </w:p>
     <w:bookmarkEnd w:id="110"/>
     <w:bookmarkEnd w:id="111"/>
     <w:bookmarkStart w:id="118" w:name="legalidad"/>
@@ -14998,20 +14911,6 @@
       </w:r>
       <w:r>
         <w:t xml:space="preserve">y no pueden usar los datos para fines distintos a operar el sistema.</w:t>
-      </w:r>
-    </w:p>
-    <w:p>
-      <w:r>
-        <w:pict>
-          <v:rect style="width:0;height:1.5pt" o:hralign="center" o:hrstd="t" o:hr="t"/>
-        </w:pict>
-      </w:r>
-    </w:p>
-    <w:p>
-      <w:r>
-        <w:pict>
-          <v:rect style="width:0;height:1.5pt" o:hralign="center" o:hrstd="t" o:hr="t"/>
-        </w:pict>
       </w:r>
     </w:p>
     <w:bookmarkEnd w:id="117"/>
@@ -15103,13 +15002,6 @@
       </w:pPr>
       <w:r>
         <w:t xml:space="preserve">Los casos de uso no detallados aquí (UC2, UC3, UC6, UC13, UC20, UC21 como contenedor, UC23, UC24, UC25, UC28, UC29, UC30, UC31, UC33, UC34, UC32) son de tipo CRUD o consulta directa y quedan cubiertos por las Historias de Usuario de la Sección 6.</w:t>
-      </w:r>
-    </w:p>
-    <w:p>
-      <w:r>
-        <w:pict>
-          <v:rect style="width:0;height:1.5pt" o:hralign="center" o:hrstd="t" o:hr="t"/>
-        </w:pict>
       </w:r>
     </w:p>
     <w:bookmarkStart w:id="121" w:name="cu-01-iniciar-sesión"/>
@@ -15746,13 +15638,6 @@
         <w:t xml:space="preserve">El sistema informa que se requiere internet para iniciar sesión y sugiere reintentar.</w:t>
       </w:r>
     </w:p>
-    <w:p>
-      <w:r>
-        <w:pict>
-          <v:rect style="width:0;height:1.5pt" o:hralign="center" o:hrstd="t" o:hr="t"/>
-        </w:pict>
-      </w:r>
-    </w:p>
     <w:bookmarkEnd w:id="121"/>
     <w:bookmarkStart w:id="122" w:name="cu-02-realizar-solicitud-de-compra"/>
     <w:p>
@@ -16372,13 +16257,6 @@
         <w:t xml:space="preserve">La solicitud se registra en cola local y se sincroniza al reconectar (RF40). Si al sincronizar el producto ya no está disponible, se notifica al comprador y se descarta la acción.</w:t>
       </w:r>
     </w:p>
-    <w:p>
-      <w:r>
-        <w:pict>
-          <v:rect style="width:0;height:1.5pt" o:hralign="center" o:hrstd="t" o:hr="t"/>
-        </w:pict>
-      </w:r>
-    </w:p>
     <w:bookmarkEnd w:id="122"/>
     <w:bookmarkStart w:id="123" w:name="X1fba38fbcdeecd04344e1d32e044df5486dab53"/>
     <w:p>
@@ -17095,13 +16973,6 @@
         <w:t xml:space="preserve">La aceptación se encola y se sincroniza al reconectar; se advierte al productor que el acuerdo aún no es visible para el comprador hasta sincronizar.</w:t>
       </w:r>
     </w:p>
-    <w:p>
-      <w:r>
-        <w:pict>
-          <v:rect style="width:0;height:1.5pt" o:hralign="center" o:hrstd="t" o:hr="t"/>
-        </w:pict>
-      </w:r>
-    </w:p>
     <w:bookmarkEnd w:id="123"/>
     <w:bookmarkStart w:id="124" w:name="Xb7cdd056e0bde0768956360068bad1bdab5138a"/>
     <w:p>
@@ -17698,13 +17569,6 @@
         <w:t xml:space="preserve">La transición y el comentario se encolan; al sincronizar se aplican en orden.</w:t>
       </w:r>
     </w:p>
-    <w:p>
-      <w:r>
-        <w:pict>
-          <v:rect style="width:0;height:1.5pt" o:hralign="center" o:hrstd="t" o:hr="t"/>
-        </w:pict>
-      </w:r>
-    </w:p>
     <w:bookmarkEnd w:id="124"/>
     <w:bookmarkStart w:id="125" w:name="X2ef6dade15e0a9565b142848355514cb13afa86"/>
     <w:p>
@@ -18410,13 +18274,6 @@
         <w:t xml:space="preserve">.</w:t>
       </w:r>
     </w:p>
-    <w:p>
-      <w:r>
-        <w:pict>
-          <v:rect style="width:0;height:1.5pt" o:hralign="center" o:hrstd="t" o:hr="t"/>
-        </w:pict>
-      </w:r>
-    </w:p>
     <w:bookmarkEnd w:id="125"/>
     <w:bookmarkStart w:id="126" w:name="cu-06-consultar-catálogo-de-productos"/>
     <w:p>
@@ -18901,13 +18758,6 @@
         <w:t xml:space="preserve">.</w:t>
       </w:r>
     </w:p>
-    <w:p>
-      <w:r>
-        <w:pict>
-          <v:rect style="width:0;height:1.5pt" o:hralign="center" o:hrstd="t" o:hr="t"/>
-        </w:pict>
-      </w:r>
-    </w:p>
     <w:bookmarkEnd w:id="126"/>
     <w:bookmarkStart w:id="127" w:name="cu-07-solicitar-cancelación-de-acuerdo"/>
     <w:p>
@@ -19502,13 +19352,6 @@
         <w:t xml:space="preserve">El botón permanece deshabilitado hasta completar el motivo.</w:t>
       </w:r>
     </w:p>
-    <w:p>
-      <w:r>
-        <w:pict>
-          <v:rect style="width:0;height:1.5pt" o:hralign="center" o:hrstd="t" o:hr="t"/>
-        </w:pict>
-      </w:r>
-    </w:p>
     <w:bookmarkEnd w:id="127"/>
     <w:bookmarkStart w:id="128" w:name="cu-08-reportar-inconformidad"/>
     <w:p>
@@ -20097,13 +19940,6 @@
         <w:t xml:space="preserve">El sistema rechaza: el caso debe tratarse por los canales de la Asociación directamente.</w:t>
       </w:r>
     </w:p>
-    <w:p>
-      <w:r>
-        <w:pict>
-          <v:rect style="width:0;height:1.5pt" o:hralign="center" o:hrstd="t" o:hr="t"/>
-        </w:pict>
-      </w:r>
-    </w:p>
     <w:bookmarkEnd w:id="128"/>
     <w:bookmarkStart w:id="129" w:name="X37be80da21ae959a6f2a737b4e736a232cfa078"/>
     <w:p>
@@ -20782,13 +20618,6 @@
         <w:t xml:space="preserve">El sistema rechaza con 403 y registra el intento (RF39, RF37).</w:t>
       </w:r>
     </w:p>
-    <w:p>
-      <w:r>
-        <w:pict>
-          <v:rect style="width:0;height:1.5pt" o:hralign="center" o:hrstd="t" o:hr="t"/>
-        </w:pict>
-      </w:r>
-    </w:p>
     <w:bookmarkEnd w:id="129"/>
     <w:bookmarkStart w:id="130" w:name="Xa98ae5e4dc9aeb466eda9e7a965600d3db35713"/>
     <w:p>
@@ -21383,13 +21212,6 @@
         <w:t xml:space="preserve">403 y log de intento.</w:t>
       </w:r>
     </w:p>
-    <w:p>
-      <w:r>
-        <w:pict>
-          <v:rect style="width:0;height:1.5pt" o:hralign="center" o:hrstd="t" o:hr="t"/>
-        </w:pict>
-      </w:r>
-    </w:p>
     <w:bookmarkEnd w:id="130"/>
     <w:bookmarkStart w:id="131" w:name="cu-11-editar-producto-propio"/>
     <w:p>
@@ -21891,13 +21713,6 @@
         <w:t xml:space="preserve">Validación inline en el campo.</w:t>
       </w:r>
     </w:p>
-    <w:p>
-      <w:r>
-        <w:pict>
-          <v:rect style="width:0;height:1.5pt" o:hralign="center" o:hrstd="t" o:hr="t"/>
-        </w:pict>
-      </w:r>
-    </w:p>
     <w:bookmarkEnd w:id="131"/>
     <w:bookmarkStart w:id="132" w:name="cu-12-acceder-al-catálogo-como-invitado"/>
     <w:p>
@@ -22328,13 +22143,6 @@
         <w:t xml:space="preserve">.</w:t>
       </w:r>
     </w:p>
-    <w:p>
-      <w:r>
-        <w:pict>
-          <v:rect style="width:0;height:1.5pt" o:hralign="center" o:hrstd="t" o:hr="t"/>
-        </w:pict>
-      </w:r>
-    </w:p>
     <w:bookmarkEnd w:id="132"/>
     <w:bookmarkStart w:id="133" w:name="trazabilidad-casos-de-uso-requerimientos"/>
     <w:p>
@@ -22824,20 +22632,6 @@
         </w:tc>
       </w:tr>
     </w:tbl>
-    <w:p>
-      <w:r>
-        <w:pict>
-          <v:rect style="width:0;height:1.5pt" o:hralign="center" o:hrstd="t" o:hr="t"/>
-        </w:pict>
-      </w:r>
-    </w:p>
-    <w:p>
-      <w:r>
-        <w:pict>
-          <v:rect style="width:0;height:1.5pt" o:hralign="center" o:hrstd="t" o:hr="t"/>
-        </w:pict>
-      </w:r>
-    </w:p>
     <w:bookmarkEnd w:id="133"/>
     <w:bookmarkEnd w:id="134"/>
     <w:bookmarkStart w:id="161" w:name="diagramas-de-actividad"/>
@@ -22912,13 +22706,6 @@
       </w:pPr>
       <w:r>
         <w:t xml:space="preserve">Se cubren los 12 casos de uso detallados más un diagrama de estados transversal para el ciclo de vida del acuerdo comercial.</w:t>
-      </w:r>
-    </w:p>
-    <w:p>
-      <w:r>
-        <w:pict>
-          <v:rect style="width:0;height:1.5pt" o:hralign="center" o:hrstd="t" o:hr="t"/>
-        </w:pict>
       </w:r>
     </w:p>
     <w:bookmarkStart w:id="136" w:name="ad-01-iniciar-sesión"/>
@@ -22968,47 +22755,6 @@
         </w:r>
       </w:hyperlink>
     </w:p>
-    <w:p>
-      <w:pPr>
-        <w:pStyle w:val="BlockText"/>
-      </w:pPr>
-      <w:r>
-        <w:rPr>
-          <w:i/>
-          <w:iCs/>
-        </w:rPr>
-        <w:t xml:space="preserve">(El archivo fuente Mermaid correspondiente está en</w:t>
-      </w:r>
-      <w:r>
-        <w:rPr>
-          <w:i/>
-          <w:iCs/>
-        </w:rPr>
-        <w:t xml:space="preserve"> </w:t>
-      </w:r>
-      <w:r>
-        <w:rPr>
-          <w:rStyle w:val="VerbatimChar"/>
-          <w:i/>
-          <w:iCs/>
-        </w:rPr>
-        <w:t xml:space="preserve">docs/diagrams/d01.mmd</w:t>
-      </w:r>
-      <w:r>
-        <w:rPr>
-          <w:i/>
-          <w:iCs/>
-        </w:rPr>
-        <w:t xml:space="preserve">.)</w:t>
-      </w:r>
-    </w:p>
-    <w:p>
-      <w:r>
-        <w:pict>
-          <v:rect style="width:0;height:1.5pt" o:hralign="center" o:hrstd="t" o:hr="t"/>
-        </w:pict>
-      </w:r>
-    </w:p>
     <w:bookmarkEnd w:id="136"/>
     <w:bookmarkStart w:id="138" w:name="ad-02-realizar-solicitud-de-compra"/>
     <w:p>
@@ -23057,47 +22803,6 @@
         </w:r>
       </w:hyperlink>
     </w:p>
-    <w:p>
-      <w:pPr>
-        <w:pStyle w:val="BlockText"/>
-      </w:pPr>
-      <w:r>
-        <w:rPr>
-          <w:i/>
-          <w:iCs/>
-        </w:rPr>
-        <w:t xml:space="preserve">(El archivo fuente Mermaid correspondiente está en</w:t>
-      </w:r>
-      <w:r>
-        <w:rPr>
-          <w:i/>
-          <w:iCs/>
-        </w:rPr>
-        <w:t xml:space="preserve"> </w:t>
-      </w:r>
-      <w:r>
-        <w:rPr>
-          <w:rStyle w:val="VerbatimChar"/>
-          <w:i/>
-          <w:iCs/>
-        </w:rPr>
-        <w:t xml:space="preserve">docs/diagrams/d02.mmd</w:t>
-      </w:r>
-      <w:r>
-        <w:rPr>
-          <w:i/>
-          <w:iCs/>
-        </w:rPr>
-        <w:t xml:space="preserve">.)</w:t>
-      </w:r>
-    </w:p>
-    <w:p>
-      <w:r>
-        <w:pict>
-          <v:rect style="width:0;height:1.5pt" o:hralign="center" o:hrstd="t" o:hr="t"/>
-        </w:pict>
-      </w:r>
-    </w:p>
     <w:bookmarkEnd w:id="138"/>
     <w:bookmarkStart w:id="140" w:name="X23275b6f69ce916d8cf0d8fa9f4d86384283427"/>
     <w:p>
@@ -23146,47 +22851,6 @@
         </w:r>
       </w:hyperlink>
     </w:p>
-    <w:p>
-      <w:pPr>
-        <w:pStyle w:val="BlockText"/>
-      </w:pPr>
-      <w:r>
-        <w:rPr>
-          <w:i/>
-          <w:iCs/>
-        </w:rPr>
-        <w:t xml:space="preserve">(El archivo fuente Mermaid correspondiente está en</w:t>
-      </w:r>
-      <w:r>
-        <w:rPr>
-          <w:i/>
-          <w:iCs/>
-        </w:rPr>
-        <w:t xml:space="preserve"> </w:t>
-      </w:r>
-      <w:r>
-        <w:rPr>
-          <w:rStyle w:val="VerbatimChar"/>
-          <w:i/>
-          <w:iCs/>
-        </w:rPr>
-        <w:t xml:space="preserve">docs/diagrams/d03.mmd</w:t>
-      </w:r>
-      <w:r>
-        <w:rPr>
-          <w:i/>
-          <w:iCs/>
-        </w:rPr>
-        <w:t xml:space="preserve">.)</w:t>
-      </w:r>
-    </w:p>
-    <w:p>
-      <w:r>
-        <w:pict>
-          <v:rect style="width:0;height:1.5pt" o:hralign="center" o:hrstd="t" o:hr="t"/>
-        </w:pict>
-      </w:r>
-    </w:p>
     <w:bookmarkEnd w:id="140"/>
     <w:bookmarkStart w:id="142" w:name="X3d867e460d6310d48a5cf500787493e97437854"/>
     <w:p>
@@ -23235,47 +22899,6 @@
         </w:r>
       </w:hyperlink>
     </w:p>
-    <w:p>
-      <w:pPr>
-        <w:pStyle w:val="BlockText"/>
-      </w:pPr>
-      <w:r>
-        <w:rPr>
-          <w:i/>
-          <w:iCs/>
-        </w:rPr>
-        <w:t xml:space="preserve">(El archivo fuente Mermaid correspondiente está en</w:t>
-      </w:r>
-      <w:r>
-        <w:rPr>
-          <w:i/>
-          <w:iCs/>
-        </w:rPr>
-        <w:t xml:space="preserve"> </w:t>
-      </w:r>
-      <w:r>
-        <w:rPr>
-          <w:rStyle w:val="VerbatimChar"/>
-          <w:i/>
-          <w:iCs/>
-        </w:rPr>
-        <w:t xml:space="preserve">docs/diagrams/d04.mmd</w:t>
-      </w:r>
-      <w:r>
-        <w:rPr>
-          <w:i/>
-          <w:iCs/>
-        </w:rPr>
-        <w:t xml:space="preserve">.)</w:t>
-      </w:r>
-    </w:p>
-    <w:p>
-      <w:r>
-        <w:pict>
-          <v:rect style="width:0;height:1.5pt" o:hralign="center" o:hrstd="t" o:hr="t"/>
-        </w:pict>
-      </w:r>
-    </w:p>
     <w:bookmarkEnd w:id="142"/>
     <w:bookmarkStart w:id="144" w:name="X3eee7e4d4bdba7af4a0b4f94a61634349c8cf13"/>
     <w:p>
@@ -23344,47 +22967,6 @@
         </w:r>
       </w:hyperlink>
     </w:p>
-    <w:p>
-      <w:pPr>
-        <w:pStyle w:val="BlockText"/>
-      </w:pPr>
-      <w:r>
-        <w:rPr>
-          <w:i/>
-          <w:iCs/>
-        </w:rPr>
-        <w:t xml:space="preserve">(El archivo fuente Mermaid correspondiente está en</w:t>
-      </w:r>
-      <w:r>
-        <w:rPr>
-          <w:i/>
-          <w:iCs/>
-        </w:rPr>
-        <w:t xml:space="preserve"> </w:t>
-      </w:r>
-      <w:r>
-        <w:rPr>
-          <w:rStyle w:val="VerbatimChar"/>
-          <w:i/>
-          <w:iCs/>
-        </w:rPr>
-        <w:t xml:space="preserve">docs/diagrams/d05.mmd</w:t>
-      </w:r>
-      <w:r>
-        <w:rPr>
-          <w:i/>
-          <w:iCs/>
-        </w:rPr>
-        <w:t xml:space="preserve">.)</w:t>
-      </w:r>
-    </w:p>
-    <w:p>
-      <w:r>
-        <w:pict>
-          <v:rect style="width:0;height:1.5pt" o:hralign="center" o:hrstd="t" o:hr="t"/>
-        </w:pict>
-      </w:r>
-    </w:p>
     <w:bookmarkEnd w:id="144"/>
     <w:bookmarkStart w:id="146" w:name="ad-06-consultar-catálogo"/>
     <w:p>
@@ -23433,47 +23015,6 @@
         </w:r>
       </w:hyperlink>
     </w:p>
-    <w:p>
-      <w:pPr>
-        <w:pStyle w:val="BlockText"/>
-      </w:pPr>
-      <w:r>
-        <w:rPr>
-          <w:i/>
-          <w:iCs/>
-        </w:rPr>
-        <w:t xml:space="preserve">(El archivo fuente Mermaid correspondiente está en</w:t>
-      </w:r>
-      <w:r>
-        <w:rPr>
-          <w:i/>
-          <w:iCs/>
-        </w:rPr>
-        <w:t xml:space="preserve"> </w:t>
-      </w:r>
-      <w:r>
-        <w:rPr>
-          <w:rStyle w:val="VerbatimChar"/>
-          <w:i/>
-          <w:iCs/>
-        </w:rPr>
-        <w:t xml:space="preserve">docs/diagrams/d06.mmd</w:t>
-      </w:r>
-      <w:r>
-        <w:rPr>
-          <w:i/>
-          <w:iCs/>
-        </w:rPr>
-        <w:t xml:space="preserve">.)</w:t>
-      </w:r>
-    </w:p>
-    <w:p>
-      <w:r>
-        <w:pict>
-          <v:rect style="width:0;height:1.5pt" o:hralign="center" o:hrstd="t" o:hr="t"/>
-        </w:pict>
-      </w:r>
-    </w:p>
     <w:bookmarkEnd w:id="146"/>
     <w:bookmarkStart w:id="148" w:name="ad-07-solicitar-cancelación"/>
     <w:p>
@@ -23522,47 +23063,6 @@
         </w:r>
       </w:hyperlink>
     </w:p>
-    <w:p>
-      <w:pPr>
-        <w:pStyle w:val="BlockText"/>
-      </w:pPr>
-      <w:r>
-        <w:rPr>
-          <w:i/>
-          <w:iCs/>
-        </w:rPr>
-        <w:t xml:space="preserve">(El archivo fuente Mermaid correspondiente está en</w:t>
-      </w:r>
-      <w:r>
-        <w:rPr>
-          <w:i/>
-          <w:iCs/>
-        </w:rPr>
-        <w:t xml:space="preserve"> </w:t>
-      </w:r>
-      <w:r>
-        <w:rPr>
-          <w:rStyle w:val="VerbatimChar"/>
-          <w:i/>
-          <w:iCs/>
-        </w:rPr>
-        <w:t xml:space="preserve">docs/diagrams/d07.mmd</w:t>
-      </w:r>
-      <w:r>
-        <w:rPr>
-          <w:i/>
-          <w:iCs/>
-        </w:rPr>
-        <w:t xml:space="preserve">.)</w:t>
-      </w:r>
-    </w:p>
-    <w:p>
-      <w:r>
-        <w:pict>
-          <v:rect style="width:0;height:1.5pt" o:hralign="center" o:hrstd="t" o:hr="t"/>
-        </w:pict>
-      </w:r>
-    </w:p>
     <w:bookmarkEnd w:id="148"/>
     <w:bookmarkStart w:id="150" w:name="ad-08-reportar-inconformidad"/>
     <w:p>
@@ -23611,47 +23111,6 @@
         </w:r>
       </w:hyperlink>
     </w:p>
-    <w:p>
-      <w:pPr>
-        <w:pStyle w:val="BlockText"/>
-      </w:pPr>
-      <w:r>
-        <w:rPr>
-          <w:i/>
-          <w:iCs/>
-        </w:rPr>
-        <w:t xml:space="preserve">(El archivo fuente Mermaid correspondiente está en</w:t>
-      </w:r>
-      <w:r>
-        <w:rPr>
-          <w:i/>
-          <w:iCs/>
-        </w:rPr>
-        <w:t xml:space="preserve"> </w:t>
-      </w:r>
-      <w:r>
-        <w:rPr>
-          <w:rStyle w:val="VerbatimChar"/>
-          <w:i/>
-          <w:iCs/>
-        </w:rPr>
-        <w:t xml:space="preserve">docs/diagrams/d08.mmd</w:t>
-      </w:r>
-      <w:r>
-        <w:rPr>
-          <w:i/>
-          <w:iCs/>
-        </w:rPr>
-        <w:t xml:space="preserve">.)</w:t>
-      </w:r>
-    </w:p>
-    <w:p>
-      <w:r>
-        <w:pict>
-          <v:rect style="width:0;height:1.5pt" o:hralign="center" o:hrstd="t" o:hr="t"/>
-        </w:pict>
-      </w:r>
-    </w:p>
     <w:bookmarkEnd w:id="150"/>
     <w:bookmarkStart w:id="152" w:name="Xd90668d4b55395973bcf06b2ed21868b7110e0d"/>
     <w:p>
@@ -23700,47 +23159,6 @@
         </w:r>
       </w:hyperlink>
     </w:p>
-    <w:p>
-      <w:pPr>
-        <w:pStyle w:val="BlockText"/>
-      </w:pPr>
-      <w:r>
-        <w:rPr>
-          <w:i/>
-          <w:iCs/>
-        </w:rPr>
-        <w:t xml:space="preserve">(El archivo fuente Mermaid correspondiente está en</w:t>
-      </w:r>
-      <w:r>
-        <w:rPr>
-          <w:i/>
-          <w:iCs/>
-        </w:rPr>
-        <w:t xml:space="preserve"> </w:t>
-      </w:r>
-      <w:r>
-        <w:rPr>
-          <w:rStyle w:val="VerbatimChar"/>
-          <w:i/>
-          <w:iCs/>
-        </w:rPr>
-        <w:t xml:space="preserve">docs/diagrams/d09.mmd</w:t>
-      </w:r>
-      <w:r>
-        <w:rPr>
-          <w:i/>
-          <w:iCs/>
-        </w:rPr>
-        <w:t xml:space="preserve">.)</w:t>
-      </w:r>
-    </w:p>
-    <w:p>
-      <w:r>
-        <w:pict>
-          <v:rect style="width:0;height:1.5pt" o:hralign="center" o:hrstd="t" o:hr="t"/>
-        </w:pict>
-      </w:r>
-    </w:p>
     <w:bookmarkEnd w:id="152"/>
     <w:bookmarkStart w:id="154" w:name="ad-10-registrar-nuevo-usuario"/>
     <w:p>
@@ -23789,47 +23207,6 @@
         </w:r>
       </w:hyperlink>
     </w:p>
-    <w:p>
-      <w:pPr>
-        <w:pStyle w:val="BlockText"/>
-      </w:pPr>
-      <w:r>
-        <w:rPr>
-          <w:i/>
-          <w:iCs/>
-        </w:rPr>
-        <w:t xml:space="preserve">(El archivo fuente Mermaid correspondiente está en</w:t>
-      </w:r>
-      <w:r>
-        <w:rPr>
-          <w:i/>
-          <w:iCs/>
-        </w:rPr>
-        <w:t xml:space="preserve"> </w:t>
-      </w:r>
-      <w:r>
-        <w:rPr>
-          <w:rStyle w:val="VerbatimChar"/>
-          <w:i/>
-          <w:iCs/>
-        </w:rPr>
-        <w:t xml:space="preserve">docs/diagrams/d10.mmd</w:t>
-      </w:r>
-      <w:r>
-        <w:rPr>
-          <w:i/>
-          <w:iCs/>
-        </w:rPr>
-        <w:t xml:space="preserve">.)</w:t>
-      </w:r>
-    </w:p>
-    <w:p>
-      <w:r>
-        <w:pict>
-          <v:rect style="width:0;height:1.5pt" o:hralign="center" o:hrstd="t" o:hr="t"/>
-        </w:pict>
-      </w:r>
-    </w:p>
     <w:bookmarkEnd w:id="154"/>
     <w:bookmarkStart w:id="156" w:name="ad-11-editar-producto-propio"/>
     <w:p>
@@ -23878,47 +23255,6 @@
         </w:r>
       </w:hyperlink>
     </w:p>
-    <w:p>
-      <w:pPr>
-        <w:pStyle w:val="BlockText"/>
-      </w:pPr>
-      <w:r>
-        <w:rPr>
-          <w:i/>
-          <w:iCs/>
-        </w:rPr>
-        <w:t xml:space="preserve">(El archivo fuente Mermaid correspondiente está en</w:t>
-      </w:r>
-      <w:r>
-        <w:rPr>
-          <w:i/>
-          <w:iCs/>
-        </w:rPr>
-        <w:t xml:space="preserve"> </w:t>
-      </w:r>
-      <w:r>
-        <w:rPr>
-          <w:rStyle w:val="VerbatimChar"/>
-          <w:i/>
-          <w:iCs/>
-        </w:rPr>
-        <w:t xml:space="preserve">docs/diagrams/d11.mmd</w:t>
-      </w:r>
-      <w:r>
-        <w:rPr>
-          <w:i/>
-          <w:iCs/>
-        </w:rPr>
-        <w:t xml:space="preserve">.)</w:t>
-      </w:r>
-    </w:p>
-    <w:p>
-      <w:r>
-        <w:pict>
-          <v:rect style="width:0;height:1.5pt" o:hralign="center" o:hrstd="t" o:hr="t"/>
-        </w:pict>
-      </w:r>
-    </w:p>
     <w:bookmarkEnd w:id="156"/>
     <w:bookmarkStart w:id="158" w:name="ad-12-acceder-al-catálogo-como-invitado"/>
     <w:p>
@@ -23967,47 +23303,6 @@
         </w:r>
       </w:hyperlink>
     </w:p>
-    <w:p>
-      <w:pPr>
-        <w:pStyle w:val="BlockText"/>
-      </w:pPr>
-      <w:r>
-        <w:rPr>
-          <w:i/>
-          <w:iCs/>
-        </w:rPr>
-        <w:t xml:space="preserve">(El archivo fuente Mermaid correspondiente está en</w:t>
-      </w:r>
-      <w:r>
-        <w:rPr>
-          <w:i/>
-          <w:iCs/>
-        </w:rPr>
-        <w:t xml:space="preserve"> </w:t>
-      </w:r>
-      <w:r>
-        <w:rPr>
-          <w:rStyle w:val="VerbatimChar"/>
-          <w:i/>
-          <w:iCs/>
-        </w:rPr>
-        <w:t xml:space="preserve">docs/diagrams/d12.mmd</w:t>
-      </w:r>
-      <w:r>
-        <w:rPr>
-          <w:i/>
-          <w:iCs/>
-        </w:rPr>
-        <w:t xml:space="preserve">.)</w:t>
-      </w:r>
-    </w:p>
-    <w:p>
-      <w:r>
-        <w:pict>
-          <v:rect style="width:0;height:1.5pt" o:hralign="center" o:hrstd="t" o:hr="t"/>
-        </w:pict>
-      </w:r>
-    </w:p>
     <w:bookmarkEnd w:id="158"/>
     <w:bookmarkStart w:id="160" w:name="X08166380a6f22920ad5af88ae0644c5a7453e2e"/>
     <w:p>
@@ -24064,54 +23359,6 @@
         </w:r>
       </w:hyperlink>
     </w:p>
-    <w:p>
-      <w:pPr>
-        <w:pStyle w:val="BlockText"/>
-      </w:pPr>
-      <w:r>
-        <w:rPr>
-          <w:i/>
-          <w:iCs/>
-        </w:rPr>
-        <w:t xml:space="preserve">(El archivo fuente Mermaid correspondiente está en</w:t>
-      </w:r>
-      <w:r>
-        <w:rPr>
-          <w:i/>
-          <w:iCs/>
-        </w:rPr>
-        <w:t xml:space="preserve"> </w:t>
-      </w:r>
-      <w:r>
-        <w:rPr>
-          <w:rStyle w:val="VerbatimChar"/>
-          <w:i/>
-          <w:iCs/>
-        </w:rPr>
-        <w:t xml:space="preserve">docs/diagrams/d13.mmd</w:t>
-      </w:r>
-      <w:r>
-        <w:rPr>
-          <w:i/>
-          <w:iCs/>
-        </w:rPr>
-        <w:t xml:space="preserve">.)</w:t>
-      </w:r>
-    </w:p>
-    <w:p>
-      <w:r>
-        <w:pict>
-          <v:rect style="width:0;height:1.5pt" o:hralign="center" o:hrstd="t" o:hr="t"/>
-        </w:pict>
-      </w:r>
-    </w:p>
-    <w:p>
-      <w:r>
-        <w:pict>
-          <v:rect style="width:0;height:1.5pt" o:hralign="center" o:hrstd="t" o:hr="t"/>
-        </w:pict>
-      </w:r>
-    </w:p>
     <w:bookmarkEnd w:id="160"/>
     <w:bookmarkEnd w:id="161"/>
     <w:bookmarkStart w:id="206" w:name="historias-de-usuario"/>
@@ -24211,13 +23458,6 @@
         <w:t xml:space="preserve">: Alta para procesos núcleo, Media para soporte, Baja para accesorios.</w:t>
       </w:r>
     </w:p>
-    <w:p>
-      <w:r>
-        <w:pict>
-          <v:rect style="width:0;height:1.5pt" o:hralign="center" o:hrstd="t" o:hr="t"/>
-        </w:pict>
-      </w:r>
-    </w:p>
     <w:bookmarkStart w:id="164" w:name="historias-del-invitado"/>
     <w:p>
       <w:pPr>
@@ -24549,13 +23789,6 @@
       </w:r>
       <w:r>
         <w:t xml:space="preserve">RF12</w:t>
-      </w:r>
-    </w:p>
-    <w:p>
-      <w:r>
-        <w:pict>
-          <v:rect style="width:0;height:1.5pt" o:hralign="center" o:hrstd="t" o:hr="t"/>
-        </w:pict>
       </w:r>
     </w:p>
     <w:bookmarkEnd w:id="163"/>
@@ -26043,13 +25276,6 @@
         <w:t xml:space="preserve">RF04</w:t>
       </w:r>
     </w:p>
-    <w:p>
-      <w:r>
-        <w:pict>
-          <v:rect style="width:0;height:1.5pt" o:hralign="center" o:hrstd="t" o:hr="t"/>
-        </w:pict>
-      </w:r>
-    </w:p>
     <w:bookmarkEnd w:id="173"/>
     <w:bookmarkEnd w:id="174"/>
     <w:bookmarkStart w:id="187" w:name="historias-del-productor"/>
@@ -27927,13 +27153,6 @@
         <w:t xml:space="preserve">RF20, RF36</w:t>
       </w:r>
     </w:p>
-    <w:p>
-      <w:r>
-        <w:pict>
-          <v:rect style="width:0;height:1.5pt" o:hralign="center" o:hrstd="t" o:hr="t"/>
-        </w:pict>
-      </w:r>
-    </w:p>
     <w:bookmarkEnd w:id="186"/>
     <w:bookmarkEnd w:id="187"/>
     <w:bookmarkStart w:id="200" w:name="historias-del-administrador-asociación"/>
@@ -29826,13 +29045,6 @@
         <w:t xml:space="preserve">RF37</w:t>
       </w:r>
     </w:p>
-    <w:p>
-      <w:r>
-        <w:pict>
-          <v:rect style="width:0;height:1.5pt" o:hralign="center" o:hrstd="t" o:hr="t"/>
-        </w:pict>
-      </w:r>
-    </w:p>
     <w:bookmarkEnd w:id="199"/>
     <w:bookmarkEnd w:id="200"/>
     <w:bookmarkStart w:id="204" w:name="Xb145b33e35fa10da3b3112de1fc9724549aab7b"/>
@@ -30303,13 +29515,6 @@
       </w:r>
       <w:r>
         <w:t xml:space="preserve">RF03</w:t>
-      </w:r>
-    </w:p>
-    <w:p>
-      <w:r>
-        <w:pict>
-          <v:rect style="width:0;height:1.5pt" o:hralign="center" o:hrstd="t" o:hr="t"/>
-        </w:pict>
       </w:r>
     </w:p>
     <w:bookmarkEnd w:id="203"/>
@@ -30683,20 +29888,6 @@
       </w:r>
       <w:r>
         <w:t xml:space="preserve">0.</w:t>
-      </w:r>
-    </w:p>
-    <w:p>
-      <w:r>
-        <w:pict>
-          <v:rect style="width:0;height:1.5pt" o:hralign="center" o:hrstd="t" o:hr="t"/>
-        </w:pict>
-      </w:r>
-    </w:p>
-    <w:p>
-      <w:r>
-        <w:pict>
-          <v:rect style="width:0;height:1.5pt" o:hralign="center" o:hrstd="t" o:hr="t"/>
-        </w:pict>
       </w:r>
     </w:p>
     <w:bookmarkEnd w:id="205"/>
@@ -33306,20 +32497,6 @@
         <w:t xml:space="preserve">del administrador con barras y torta.</w:t>
       </w:r>
     </w:p>
-    <w:p>
-      <w:r>
-        <w:pict>
-          <v:rect style="width:0;height:1.5pt" o:hralign="center" o:hrstd="t" o:hr="t"/>
-        </w:pict>
-      </w:r>
-    </w:p>
-    <w:p>
-      <w:r>
-        <w:pict>
-          <v:rect style="width:0;height:1.5pt" o:hralign="center" o:hrstd="t" o:hr="t"/>
-        </w:pict>
-      </w:r>
-    </w:p>
     <w:bookmarkEnd w:id="218"/>
     <w:bookmarkEnd w:id="219"/>
     <w:bookmarkStart w:id="231" w:name="diagrama-de-componentes"/>
@@ -33399,13 +32576,6 @@
       </w:pPr>
       <w:r>
         <w:t xml:space="preserve">Ambos diagramas usan notación Mermaid para mantener coherencia con las secciones anteriores y ser renderizables directamente en el repositorio.</w:t>
-      </w:r>
-    </w:p>
-    <w:p>
-      <w:r>
-        <w:pict>
-          <v:rect style="width:0;height:1.5pt" o:hralign="center" o:hrstd="t" o:hr="t"/>
-        </w:pict>
       </w:r>
     </w:p>
     <w:bookmarkStart w:id="221" w:name="diagrama-general-de-infraestructura"/>
@@ -33488,48 +32658,111 @@
     </w:p>
     <w:p>
       <w:pPr>
-        <w:pStyle w:val="BlockText"/>
-      </w:pPr>
+        <w:pStyle w:val="FirstParagraph"/>
+      </w:pPr>
+      <w:r>
+        <w:rPr>
+          <w:b/>
+          <w:bCs/>
+        </w:rPr>
+        <w:t xml:space="preserve">Observaciones de despliegue</w:t>
+      </w:r>
+    </w:p>
+    <w:p>
+      <w:pPr>
+        <w:pStyle w:val="Compact"/>
+        <w:numPr>
+          <w:ilvl w:val="0"/>
+          <w:numId w:val="1104"/>
+        </w:numPr>
+      </w:pPr>
+      <w:r>
+        <w:t xml:space="preserve">El</w:t>
+      </w:r>
+      <w:r>
+        <w:t xml:space="preserve"> </w:t>
+      </w:r>
+      <w:r>
+        <w:rPr>
+          <w:b/>
+          <w:bCs/>
+        </w:rPr>
+        <w:t xml:space="preserve">bundle estático</w:t>
+      </w:r>
+      <w:r>
+        <w:t xml:space="preserve"> </w:t>
+      </w:r>
+      <w:r>
+        <w:t xml:space="preserve">(HTML + JS + CSS) se sirve desde un CDN o GitHub Pages (como el prototipo actual). Esto minimiza el costo recurrente y mejora los tiempos de carga desde zonas rurales.</w:t>
+      </w:r>
+    </w:p>
+    <w:p>
+      <w:pPr>
+        <w:pStyle w:val="Compact"/>
+        <w:numPr>
+          <w:ilvl w:val="0"/>
+          <w:numId w:val="1104"/>
+        </w:numPr>
+      </w:pPr>
+      <w:r>
+        <w:t xml:space="preserve">La</w:t>
+      </w:r>
+      <w:r>
+        <w:t xml:space="preserve"> </w:t>
+      </w:r>
+      <w:r>
+        <w:rPr>
+          <w:b/>
+          <w:bCs/>
+        </w:rPr>
+        <w:t xml:space="preserve">API REST</w:t>
+      </w:r>
+      <w:r>
+        <w:t xml:space="preserve"> </w:t>
+      </w:r>
+      <w:r>
+        <w:t xml:space="preserve">se publica en un proveedor de nube (p. ej. Render, Fly.io, AWS ECS o similar). Se elige una opción con escalado automático y costos predecibles para que la Asociación pueda presupuestar el mantenimiento con transparencia (RNF31).</w:t>
+      </w:r>
+    </w:p>
+    <w:p>
+      <w:pPr>
+        <w:pStyle w:val="Compact"/>
+        <w:numPr>
+          <w:ilvl w:val="0"/>
+          <w:numId w:val="1104"/>
+        </w:numPr>
+      </w:pPr>
+      <w:r>
+        <w:t xml:space="preserve">La</w:t>
+      </w:r>
+      <w:r>
+        <w:t xml:space="preserve"> </w:t>
+      </w:r>
+      <w:r>
+        <w:rPr>
+          <w:b/>
+          <w:bCs/>
+        </w:rPr>
+        <w:t xml:space="preserve">base de datos</w:t>
+      </w:r>
+      <w:r>
+        <w:t xml:space="preserve"> </w:t>
+      </w:r>
+      <w:r>
+        <w:t xml:space="preserve">se gestiona como servicio (PostgreSQL gestionado), lo que elimina la administración manual de respaldos y</w:t>
+      </w:r>
+      <w:r>
+        <w:t xml:space="preserve"> </w:t>
+      </w:r>
       <w:r>
         <w:rPr>
           <w:i/>
           <w:iCs/>
         </w:rPr>
-        <w:t xml:space="preserve">(El archivo fuente Mermaid correspondiente está en</w:t>
-      </w:r>
-      <w:r>
-        <w:rPr>
-          <w:i/>
-          <w:iCs/>
-        </w:rPr>
-        <w:t xml:space="preserve"> </w:t>
-      </w:r>
-      <w:r>
-        <w:rPr>
-          <w:rStyle w:val="VerbatimChar"/>
-          <w:i/>
-          <w:iCs/>
-        </w:rPr>
-        <w:t xml:space="preserve">docs/diagrams/d14.mmd</w:t>
-      </w:r>
-      <w:r>
-        <w:rPr>
-          <w:i/>
-          <w:iCs/>
-        </w:rPr>
-        <w:t xml:space="preserve">.)</w:t>
-      </w:r>
-    </w:p>
-    <w:p>
-      <w:pPr>
-        <w:pStyle w:val="FirstParagraph"/>
-      </w:pPr>
-      <w:r>
-        <w:rPr>
-          <w:b/>
-          <w:bCs/>
-        </w:rPr>
-        <w:t xml:space="preserve">Observaciones de despliegue</w:t>
+        <w:t xml:space="preserve">patching</w:t>
+      </w:r>
+      <w:r>
+        <w:t xml:space="preserve">.</w:t>
       </w:r>
     </w:p>
     <w:p>
@@ -33551,13 +32784,13 @@
           <w:b/>
           <w:bCs/>
         </w:rPr>
-        <w:t xml:space="preserve">bundle estático</w:t>
-      </w:r>
-      <w:r>
-        <w:t xml:space="preserve"> </w:t>
-      </w:r>
-      <w:r>
-        <w:t xml:space="preserve">(HTML + JS + CSS) se sirve desde un CDN o GitHub Pages (como el prototipo actual). Esto minimiza el costo recurrente y mejora los tiempos de carga desde zonas rurales.</w:t>
+        <w:t xml:space="preserve">gateway SMS</w:t>
+      </w:r>
+      <w:r>
+        <w:t xml:space="preserve"> </w:t>
+      </w:r>
+      <w:r>
+        <w:t xml:space="preserve">es un servicio de terceros; su cuenta se factura a la Asociación. Se elige uno con cobertura nacional y precios en el rango de USD 0.05–0.10 por mensaje.</w:t>
       </w:r>
     </w:p>
     <w:p>
@@ -33569,103 +32802,6 @@
         </w:numPr>
       </w:pPr>
       <w:r>
-        <w:t xml:space="preserve">La</w:t>
-      </w:r>
-      <w:r>
-        <w:t xml:space="preserve"> </w:t>
-      </w:r>
-      <w:r>
-        <w:rPr>
-          <w:b/>
-          <w:bCs/>
-        </w:rPr>
-        <w:t xml:space="preserve">API REST</w:t>
-      </w:r>
-      <w:r>
-        <w:t xml:space="preserve"> </w:t>
-      </w:r>
-      <w:r>
-        <w:t xml:space="preserve">se publica en un proveedor de nube (p. ej. Render, Fly.io, AWS ECS o similar). Se elige una opción con escalado automático y costos predecibles para que la Asociación pueda presupuestar el mantenimiento con transparencia (RNF31).</w:t>
-      </w:r>
-    </w:p>
-    <w:p>
-      <w:pPr>
-        <w:pStyle w:val="Compact"/>
-        <w:numPr>
-          <w:ilvl w:val="0"/>
-          <w:numId w:val="1104"/>
-        </w:numPr>
-      </w:pPr>
-      <w:r>
-        <w:t xml:space="preserve">La</w:t>
-      </w:r>
-      <w:r>
-        <w:t xml:space="preserve"> </w:t>
-      </w:r>
-      <w:r>
-        <w:rPr>
-          <w:b/>
-          <w:bCs/>
-        </w:rPr>
-        <w:t xml:space="preserve">base de datos</w:t>
-      </w:r>
-      <w:r>
-        <w:t xml:space="preserve"> </w:t>
-      </w:r>
-      <w:r>
-        <w:t xml:space="preserve">se gestiona como servicio (PostgreSQL gestionado), lo que elimina la administración manual de respaldos y</w:t>
-      </w:r>
-      <w:r>
-        <w:t xml:space="preserve"> </w:t>
-      </w:r>
-      <w:r>
-        <w:rPr>
-          <w:i/>
-          <w:iCs/>
-        </w:rPr>
-        <w:t xml:space="preserve">patching</w:t>
-      </w:r>
-      <w:r>
-        <w:t xml:space="preserve">.</w:t>
-      </w:r>
-    </w:p>
-    <w:p>
-      <w:pPr>
-        <w:pStyle w:val="Compact"/>
-        <w:numPr>
-          <w:ilvl w:val="0"/>
-          <w:numId w:val="1104"/>
-        </w:numPr>
-      </w:pPr>
-      <w:r>
-        <w:t xml:space="preserve">El</w:t>
-      </w:r>
-      <w:r>
-        <w:t xml:space="preserve"> </w:t>
-      </w:r>
-      <w:r>
-        <w:rPr>
-          <w:b/>
-          <w:bCs/>
-        </w:rPr>
-        <w:t xml:space="preserve">gateway SMS</w:t>
-      </w:r>
-      <w:r>
-        <w:t xml:space="preserve"> </w:t>
-      </w:r>
-      <w:r>
-        <w:t xml:space="preserve">es un servicio de terceros; su cuenta se factura a la Asociación. Se elige uno con cobertura nacional y precios en el rango de USD 0.05–0.10 por mensaje.</w:t>
-      </w:r>
-    </w:p>
-    <w:p>
-      <w:pPr>
-        <w:pStyle w:val="Compact"/>
-        <w:numPr>
-          <w:ilvl w:val="0"/>
-          <w:numId w:val="1104"/>
-        </w:numPr>
-      </w:pPr>
-      <w:r>
         <w:t xml:space="preserve">Los</w:t>
       </w:r>
       <w:r>
@@ -33695,13 +32831,6 @@
       </w:r>
       <w:r>
         <w:t xml:space="preserve">la app desde el navegador para obtener ícono en el home-screen y experiencia similar a nativa (RNF34).</w:t>
-      </w:r>
-    </w:p>
-    <w:p>
-      <w:r>
-        <w:pict>
-          <v:rect style="width:0;height:1.5pt" o:hralign="center" o:hrstd="t" o:hr="t"/>
-        </w:pict>
       </w:r>
     </w:p>
     <w:bookmarkEnd w:id="221"/>
@@ -33775,47 +32904,6 @@
           <w:t xml:space="preserve">https://github.com/AlexAlvarado1290/Proyecto-Analisis-de-sistemas/blob/main/docs/diagrams/d15.png</w:t>
         </w:r>
       </w:hyperlink>
-    </w:p>
-    <w:p>
-      <w:pPr>
-        <w:pStyle w:val="BlockText"/>
-      </w:pPr>
-      <w:r>
-        <w:rPr>
-          <w:i/>
-          <w:iCs/>
-        </w:rPr>
-        <w:t xml:space="preserve">(El archivo fuente Mermaid correspondiente está en</w:t>
-      </w:r>
-      <w:r>
-        <w:rPr>
-          <w:i/>
-          <w:iCs/>
-        </w:rPr>
-        <w:t xml:space="preserve"> </w:t>
-      </w:r>
-      <w:r>
-        <w:rPr>
-          <w:rStyle w:val="VerbatimChar"/>
-          <w:i/>
-          <w:iCs/>
-        </w:rPr>
-        <w:t xml:space="preserve">docs/diagrams/d15.mmd</w:t>
-      </w:r>
-      <w:r>
-        <w:rPr>
-          <w:i/>
-          <w:iCs/>
-        </w:rPr>
-        <w:t xml:space="preserve">.)</w:t>
-      </w:r>
-    </w:p>
-    <w:p>
-      <w:r>
-        <w:pict>
-          <v:rect style="width:0;height:1.5pt" o:hralign="center" o:hrstd="t" o:hr="t"/>
-        </w:pict>
-      </w:r>
     </w:p>
     <w:bookmarkEnd w:id="223"/>
     <w:bookmarkStart w:id="228" w:name="X21b470243018c2690c964708d01b12bbb621914"/>
@@ -34767,13 +33855,6 @@
         </w:tc>
       </w:tr>
     </w:tbl>
-    <w:p>
-      <w:r>
-        <w:pict>
-          <v:rect style="width:0;height:1.5pt" o:hralign="center" o:hrstd="t" o:hr="t"/>
-        </w:pict>
-      </w:r>
-    </w:p>
     <w:bookmarkEnd w:id="227"/>
     <w:bookmarkEnd w:id="228"/>
     <w:bookmarkStart w:id="229" w:name="patrones-de-diseño-previstos"/>
@@ -35195,13 +34276,6 @@
         <w:t xml:space="preserve">La fase 3 (desarrollo) documentará en el código los archivos concretos donde cada patrón se materializa y una breve justificación por patrón, acompañando el entregable.</w:t>
       </w:r>
     </w:p>
-    <w:p>
-      <w:r>
-        <w:pict>
-          <v:rect style="width:0;height:1.5pt" o:hralign="center" o:hrstd="t" o:hr="t"/>
-        </w:pict>
-      </w:r>
-    </w:p>
     <w:bookmarkEnd w:id="229"/>
     <w:bookmarkStart w:id="230" w:name="consideraciones-de-despliegue-y-costos"/>
     <w:p>
@@ -35560,20 +34634,6 @@
       </w:r>
       <w:r>
         <w:t xml:space="preserve">para el mantenimiento correctivo o evolutivo puntual contratado a un proveedor externo, conforme al supuesto de mantenimiento autónomo con soporte contratado por demanda.</w:t>
-      </w:r>
-    </w:p>
-    <w:p>
-      <w:r>
-        <w:pict>
-          <v:rect style="width:0;height:1.5pt" o:hralign="center" o:hrstd="t" o:hr="t"/>
-        </w:pict>
-      </w:r>
-    </w:p>
-    <w:p>
-      <w:r>
-        <w:pict>
-          <v:rect style="width:0;height:1.5pt" o:hralign="center" o:hrstd="t" o:hr="t"/>
-        </w:pict>
       </w:r>
     </w:p>
     <w:bookmarkEnd w:id="230"/>
@@ -38116,20 +37176,6 @@
         <w:t xml:space="preserve">.</w:t>
       </w:r>
     </w:p>
-    <w:p>
-      <w:r>
-        <w:pict>
-          <v:rect style="width:0;height:1.5pt" o:hralign="center" o:hrstd="t" o:hr="t"/>
-        </w:pict>
-      </w:r>
-    </w:p>
-    <w:p>
-      <w:r>
-        <w:pict>
-          <v:rect style="width:0;height:1.5pt" o:hralign="center" o:hrstd="t" o:hr="t"/>
-        </w:pict>
-      </w:r>
-    </w:p>
     <w:bookmarkEnd w:id="246"/>
     <w:bookmarkEnd w:id="247"/>
     <w:bookmarkStart w:id="256" w:name="anexo-b-stack-tecnológico"/>
@@ -38225,13 +37271,6 @@
       </w:pPr>
       <w:r>
         <w:t xml:space="preserve">El stack se organiza en cuatro capas (cliente, servidor, datos e infraestructura) más servicios transversales de DevOps y terceros.</w:t>
-      </w:r>
-    </w:p>
-    <w:p>
-      <w:r>
-        <w:pict>
-          <v:rect style="width:0;height:1.5pt" o:hralign="center" o:hrstd="t" o:hr="t"/>
-        </w:pict>
       </w:r>
     </w:p>
     <w:bookmarkStart w:id="248" w:name="b.1-cliente-frontend-pwa"/>
@@ -39069,13 +38108,6 @@
         <w:t xml:space="preserve">→ menor control tipográfico y más peso que Tailwind.</w:t>
       </w:r>
     </w:p>
-    <w:p>
-      <w:r>
-        <w:pict>
-          <v:rect style="width:0;height:1.5pt" o:hralign="center" o:hrstd="t" o:hr="t"/>
-        </w:pict>
-      </w:r>
-    </w:p>
     <w:bookmarkEnd w:id="248"/>
     <w:bookmarkStart w:id="249" w:name="b.2-servidor-backend-api"/>
     <w:p>
@@ -39905,13 +38937,6 @@
         <w:t xml:space="preserve">→ más flexible que Prisma pero con tipos menos estrictos y migraciones menos pulidas.</w:t>
       </w:r>
     </w:p>
-    <w:p>
-      <w:r>
-        <w:pict>
-          <v:rect style="width:0;height:1.5pt" o:hralign="center" o:hrstd="t" o:hr="t"/>
-        </w:pict>
-      </w:r>
-    </w:p>
     <w:bookmarkEnd w:id="249"/>
     <w:bookmarkStart w:id="250" w:name="b.3-base-de-datos"/>
     <w:p>
@@ -40150,13 +39175,6 @@
         <w:t xml:space="preserve">→ el dominio (usuarios, productos, acuerdos con relaciones) es fuertemente relacional; un modelo documental introduciría complicaciones sin beneficios claros.</w:t>
       </w:r>
     </w:p>
-    <w:p>
-      <w:r>
-        <w:pict>
-          <v:rect style="width:0;height:1.5pt" o:hralign="center" o:hrstd="t" o:hr="t"/>
-        </w:pict>
-      </w:r>
-    </w:p>
     <w:bookmarkEnd w:id="250"/>
     <w:bookmarkStart w:id="251" w:name="b.4-infraestructura-y-despliegue"/>
     <w:p>
@@ -40582,13 +39600,6 @@
         <w:t xml:space="preserve">→ costos aumentados tras 2022, alternativas equivalentes más baratas.</w:t>
       </w:r>
     </w:p>
-    <w:p>
-      <w:r>
-        <w:pict>
-          <v:rect style="width:0;height:1.5pt" o:hralign="center" o:hrstd="t" o:hr="t"/>
-        </w:pict>
-      </w:r>
-    </w:p>
     <w:bookmarkEnd w:id="251"/>
     <w:bookmarkStart w:id="252" w:name="b.5-devops-y-calidad"/>
     <w:p>
@@ -40957,13 +39968,6 @@
         </w:tc>
       </w:tr>
     </w:tbl>
-    <w:p>
-      <w:r>
-        <w:pict>
-          <v:rect style="width:0;height:1.5pt" o:hralign="center" o:hrstd="t" o:hr="t"/>
-        </w:pict>
-      </w:r>
-    </w:p>
     <w:bookmarkEnd w:id="252"/>
     <w:bookmarkStart w:id="253" w:name="b.6-servicios-de-terceros"/>
     <w:p>
@@ -41192,13 +40196,6 @@
         </w:tc>
       </w:tr>
     </w:tbl>
-    <w:p>
-      <w:r>
-        <w:pict>
-          <v:rect style="width:0;height:1.5pt" o:hralign="center" o:hrstd="t" o:hr="t"/>
-        </w:pict>
-      </w:r>
-    </w:p>
     <w:bookmarkEnd w:id="253"/>
     <w:bookmarkStart w:id="254" w:name="b.7-mapa-patrones-de-diseño-stack"/>
     <w:p>
@@ -41563,13 +40560,6 @@
         </w:tc>
       </w:tr>
     </w:tbl>
-    <w:p>
-      <w:r>
-        <w:pict>
-          <v:rect style="width:0;height:1.5pt" o:hralign="center" o:hrstd="t" o:hr="t"/>
-        </w:pict>
-      </w:r>
-    </w:p>
     <w:bookmarkEnd w:id="254"/>
     <w:bookmarkStart w:id="255" w:name="b.8-resumen-ejecutivo-del-stack"/>
     <w:p>
@@ -41704,15 +40694,8 @@
       </w:r>
     </w:p>
     <w:p>
-      <w:r>
-        <w:pict>
-          <v:rect style="width:0;height:1.5pt" o:hralign="center" o:hrstd="t" o:hr="t"/>
-        </w:pict>
-      </w:r>
-    </w:p>
-    <w:p>
-      <w:pPr>
-        <w:pStyle w:val="FirstParagraph"/>
+      <w:pPr>
+        <w:pStyle w:val="BodyText"/>
       </w:pPr>
       <w:r>
         <w:rPr>
@@ -41720,13 +40703,6 @@
           <w:iCs/>
         </w:rPr>
         <w:t xml:space="preserve">Fin del Anexo B y del documento DERCAS del Proyecto II.</w:t>
-      </w:r>
-    </w:p>
-    <w:p>
-      <w:r>
-        <w:pict>
-          <v:rect style="width:0;height:1.5pt" o:hralign="center" o:hrstd="t" o:hr="t"/>
-        </w:pict>
       </w:r>
     </w:p>
     <w:bookmarkEnd w:id="255"/>
@@ -43259,8 +42235,6 @@
     <w:next w:val="BodyText"/>
     <w:qFormat/>
     <w:pPr>
-      <w:keepNext/>
-      <w:keepLines/>
     </w:pPr>
     <w:rPr>
       <w:sz w:val="24"/>
@@ -43273,8 +42247,6 @@
     <w:next w:val="BodyText"/>
     <w:qFormat/>
     <w:pPr>
-      <w:keepNext/>
-      <w:keepLines/>
     </w:pPr>
     <w:rPr>
       <w:sz w:val="24"/>
@@ -43287,8 +42259,6 @@
     <w:next w:val="Abstract"/>
     <w:qFormat/>
     <w:pPr>
-      <w:keepNext/>
-      <w:keepLines/>
       <w:spacing w:after="0" w:before="300"/>
       <w:jc w:val="center"/>
     </w:pPr>
@@ -43304,8 +42274,6 @@
     <w:next w:val="BodyText"/>
     <w:qFormat/>
     <w:pPr>
-      <w:keepNext/>
-      <w:keepLines/>
       <w:spacing w:after="300" w:before="100"/>
     </w:pPr>
     <w:rPr>
@@ -43330,8 +42298,6 @@
     <w:qFormat/>
     <w:rsid w:val="00A10FD9"/>
     <w:pPr>
-      <w:keepNext/>
-      <w:keepLines/>
       <w:spacing w:after="80" w:before="240"/>
       <w:outlineLvl w:val="0"/>
       <w:pageBreakBefore w:val="false"/>
@@ -43354,8 +42320,6 @@
     <w:qFormat/>
     <w:rsid w:val="00A10FD9"/>
     <w:pPr>
-      <w:keepNext/>
-      <w:keepLines/>
       <w:spacing w:after="80" w:before="160"/>
       <w:outlineLvl w:val="1"/>
     </w:pPr>
@@ -43377,8 +42341,6 @@
     <w:qFormat/>
     <w:rsid w:val="00A10FD9"/>
     <w:pPr>
-      <w:keepNext/>
-      <w:keepLines/>
       <w:spacing w:after="80" w:before="160"/>
       <w:outlineLvl w:val="2"/>
     </w:pPr>
@@ -43400,8 +42362,6 @@
     <w:qFormat/>
     <w:rsid w:val="00A10FD9"/>
     <w:pPr>
-      <w:keepNext/>
-      <w:keepLines/>
       <w:spacing w:after="40" w:before="80"/>
       <w:outlineLvl w:val="3"/>
     </w:pPr>
@@ -43423,8 +42383,6 @@
     <w:qFormat/>
     <w:rsid w:val="00A10FD9"/>
     <w:pPr>
-      <w:keepNext/>
-      <w:keepLines/>
       <w:spacing w:after="40" w:before="80"/>
       <w:outlineLvl w:val="4"/>
     </w:pPr>
@@ -43444,8 +42402,6 @@
     <w:qFormat/>
     <w:rsid w:val="00A10FD9"/>
     <w:pPr>
-      <w:keepNext/>
-      <w:keepLines/>
       <w:spacing w:after="0" w:before="40"/>
       <w:outlineLvl w:val="5"/>
     </w:pPr>
@@ -43467,8 +42423,6 @@
     <w:qFormat/>
     <w:rsid w:val="00A10FD9"/>
     <w:pPr>
-      <w:keepNext/>
-      <w:keepLines/>
       <w:spacing w:after="0" w:before="40"/>
       <w:outlineLvl w:val="6"/>
     </w:pPr>
@@ -43488,8 +42442,6 @@
     <w:qFormat/>
     <w:rsid w:val="00A10FD9"/>
     <w:pPr>
-      <w:keepNext/>
-      <w:keepLines/>
       <w:spacing w:after="0"/>
       <w:outlineLvl w:val="7"/>
     </w:pPr>
@@ -43511,8 +42463,6 @@
     <w:qFormat/>
     <w:rsid w:val="00A10FD9"/>
     <w:pPr>
-      <w:keepNext/>
-      <w:keepLines/>
       <w:spacing w:after="0"/>
       <w:outlineLvl w:val="8"/>
     </w:pPr>
@@ -43706,8 +42656,6 @@
     <w:basedOn w:val="Normal"/>
     <w:next w:val="Definition"/>
     <w:pPr>
-      <w:keepNext/>
-      <w:keepLines/>
       <w:spacing w:after="0"/>
     </w:pPr>
     <w:rPr>
@@ -43733,7 +42681,6 @@
     <w:name w:val="Table Caption"/>
     <w:basedOn w:val="Caption"/>
     <w:pPr>
-      <w:keepNext/>
     </w:pPr>
   </w:style>
   <w:style w:customStyle="1" w:styleId="ImageCaption" w:type="paragraph">
@@ -43748,7 +42695,6 @@
     <w:name w:val="Captioned Figure"/>
     <w:basedOn w:val="Figure"/>
     <w:pPr>
-      <w:keepNext/>
     </w:pPr>
   </w:style>
   <w:style w:customStyle="1" w:styleId="BodyTextChar" w:type="character">
@@ -43799,6 +42745,11 @@
       <w:bCs w:val="0"/>
       <w:color w:themeColor="accent1" w:themeShade="BF" w:val="365F91"/>
     </w:rPr>
+  </w:style>
+  <w:style w:type="paragraph" w:customStyle="1" w:styleId="Portada">
+    <w:name w:val="Portada"/>
+    <w:basedOn w:val="BodyText"/>
+    <w:qFormat/>
   </w:style>
   <w:style w:type="paragraph" w:customStyle="1" w:styleId="SourceCode">
     <w:name w:val="Source Code"/>

</xml_diff>